<commit_message>
Re-record the sample runs with the Tavily cost split and basic search
Co-Authored-By: Claude Opus 5.5 <noreply@anthropic.com>
</commit_message>
<xml_diff>
--- a/frontend/public/samples/01-medicamento-no-pbs/tutela-salud-andina.docx
+++ b/frontend/public/samples/01-medicamento-no-pbs/tutela-salud-andina.docx
@@ -107,7 +107,7 @@
         <w:rPr>
           <w:b w:val="0"/>
         </w:rPr>
-        <w:t>DERECHOS INVOCADOS: la salud, consagrado en el artículo 49 de la Constitución Política., la vida digna, vinculado al artículo 1° de la Constitución Política., la seguridad social, establecido en el artículo 48 de la Constitución Política., la dignidad humana, reconocido en el artículo 1° de la Constitución Política.</w:t>
+        <w:t>DERECHOS INVOCADOS: salud, vida digna, seguridad social, dignidad humana, vida</w:t>
       </w:r>
     </w:p>
     <w:p>
@@ -139,7 +139,7 @@
         <w:rPr>
           <w:b w:val="0"/>
         </w:rPr>
-        <w:t>, domiciliado(a) en Bucaramanga, actuando en nombre propio, respetuosamente presento ACCIÓN DE TUTELA contra Salud Andina, con fundamento en el artículo 86 de la Constitución Política y el Decreto 2591 de 1991, para que se protejan mis derechos fundamentales a la salud, consagrado en el artículo 49 de la Constitución Política., la vida digna, vinculado al artículo 1° de la Constitución Política., la seguridad social, establecido en el artículo 48 de la Constitución Política., la dignidad humana, reconocido en el artículo 1° de la Constitución Política., con base en los siguientes:</w:t>
+        <w:t>, domiciliado(a) en Bucaramanga, actuando en nombre propio, respetuosamente presento ACCIÓN DE TUTELA contra Salud Andina, con fundamento en el artículo 86 de la Constitución Política y el Decreto 2591 de 1991, para que se protejan mis derechos fundamentales a salud, vida digna, seguridad social, dignidad humana, vida, con base en los siguientes:</w:t>
       </w:r>
     </w:p>
     <w:p>
@@ -163,7 +163,7 @@
         <w:rPr>
           <w:b w:val="0"/>
         </w:rPr>
-        <w:t>1. Yo, mayor de edad, residente en Bucaramanga, afiliado a la EPS Salud Andina, formulo los siguientes hechos:</w:t>
+        <w:t>1. El 3 de agosto de 2026 mi médico tratante formuló el medicamento tofacitinib para el tratamiento de mi artritis reumatoide.</w:t>
       </w:r>
     </w:p>
     <w:p>
@@ -175,7 +175,7 @@
         <w:rPr>
           <w:b w:val="0"/>
         </w:rPr>
-        <w:t>2. El 3 de agosto de 2026, mi reumatóloga en clínica me formuló el medicamento tofacitinib para el tratamiento de mi artritis reumatoide.</w:t>
+        <w:t>2. El 10 de agosto de 2026 radiqué la solicitud de autorización del medicamento tofacitinib ante la EPS Salud Andina.</w:t>
       </w:r>
     </w:p>
     <w:p>
@@ -187,7 +187,7 @@
         <w:rPr>
           <w:b w:val="0"/>
         </w:rPr>
-        <w:t>3. El 10 de agosto de 2026, presenté la solicitud de autorización y entrega del medicamento tofacitinib ante la EPS Salud Andina.</w:t>
+        <w:t>3. El 2 de septiembre de 2026 recibí carta de negación por parte de la EPS Salud Andina, en la cual se indica que el medicamento tofacitinib no está incluido en el Plan de Beneficios en Salud (PBS) y que no puede ser financiado por el Sistema General de Seguridad Social en Salud.</w:t>
       </w:r>
     </w:p>
     <w:p>
@@ -199,19 +199,7 @@
         <w:rPr>
           <w:b w:val="0"/>
         </w:rPr>
-        <w:t>4. El 2 de septiembre de 2026, recibí una carta de negación por parte de la EPS Salud Andina, en la cual se negó expresamente la entrega del medicamento tofacitinib.</w:t>
-      </w:r>
-    </w:p>
-    <w:p>
-      <w:pPr>
-        <w:ind w:left="340" w:hanging="340"/>
-        <w:jc w:val="both"/>
-      </w:pPr>
-      <w:r>
-        <w:rPr>
-          <w:b w:val="0"/>
-        </w:rPr>
-        <w:t>5. El 8 de septiembre de 2026, presenté un derecho de petición ante la EPS Salud Andina solicitando la revisión y respuesta a mi solicitud de tofacitinib, el cual no ha sido respondido a la fecha.</w:t>
+        <w:t>4. El 8 de septiembre de 2026 presenté un derecho de petición ante la EPS Salud Andina solicitando una respuesta fundamentada a la negación del medicamento tofacitinib, al cual no he recibido respuesta hasta la fecha.</w:t>
       </w:r>
     </w:p>
     <w:p>
@@ -235,7 +223,7 @@
         <w:rPr>
           <w:b w:val="0"/>
         </w:rPr>
-        <w:t>1. El derecho fundamental a la salud, consagrado en el artículo 49 de la Constitución Política.</w:t>
+        <w:t>1. salud</w:t>
       </w:r>
     </w:p>
     <w:p>
@@ -247,7 +235,7 @@
         <w:rPr>
           <w:b w:val="0"/>
         </w:rPr>
-        <w:t>2. El derecho a la vida digna, vinculado al artículo 1° de la Constitución Política.</w:t>
+        <w:t>2. vida digna</w:t>
       </w:r>
     </w:p>
     <w:p>
@@ -259,7 +247,7 @@
         <w:rPr>
           <w:b w:val="0"/>
         </w:rPr>
-        <w:t>3. El derecho a la seguridad social, establecido en el artículo 48 de la Constitución Política.</w:t>
+        <w:t>3. seguridad social</w:t>
       </w:r>
     </w:p>
     <w:p>
@@ -271,7 +259,19 @@
         <w:rPr>
           <w:b w:val="0"/>
         </w:rPr>
-        <w:t>4. El derecho a la dignidad humana, reconocido en el artículo 1° de la Constitución Política.</w:t>
+        <w:t>4. dignidad humana</w:t>
+      </w:r>
+    </w:p>
+    <w:p>
+      <w:pPr>
+        <w:ind w:left="340" w:hanging="340"/>
+        <w:jc w:val="both"/>
+      </w:pPr>
+      <w:r>
+        <w:rPr>
+          <w:b w:val="0"/>
+        </w:rPr>
+        <w:t>5. vida</w:t>
       </w:r>
     </w:p>
     <w:p>
@@ -294,7 +294,7 @@
         <w:rPr>
           <w:b w:val="0"/>
         </w:rPr>
-        <w:t>La acción de tutela procede conforme al artículo 86 de la Constitución Política, ya que se trata de un derecho fundamental vulnerado por actuación u omisión de autoridad pública o de quien ejerza funciones públicas, como es el caso de la EPS Salud Andina al negar un servicio de salud prescrito por el médico tratante. Asimismo, el Decreto 2591 de 1991 regula la acción de tutela y establece su procedencia cuando se vulneran derechos fundamentales y no existe otro medio más idóneo para su protección. La Ley Estatutaria de Salud 1751 de 2015, en su artículo 1°, garantiza el acceso oportuno y necesario a los servicios de salud, incluyendo medicamentos, cuando sean indispensables para la protección de la vida y la dignidad humana. En este sentido, la Corte Constitucional ha señalado que la negativa de una EPS a suministrar un medicamento prescrito por el médico tratante, aun cuando no esté incluido en el Plan de Beneficios en Salud (PBS), vulnera el derecho fundamental a la salud cuando su omisión pone en riesgo la integridad física o la vida del paciente. Esto ha sido reiterado en múltiples sentencias: la Sentencia T-305 de 2006 establece que la negación de un medicamento excluido del Manual del Plan Obligatorio de Salud por una EPS vulnera el derecho a la salud, tal como ocurre en este caso con el tofacitinib para artritis reumatoide. La Sentencia T-1314 de 2005 reitera el deber del EPS de surtir medicamentos excluidos del POS cuando su omisión pone en riesgo derechos fundamentales como la salud, aplicable directamente a la denegación de tofacitinib. La Sentencia T-500 de 2025 reafirma que el derecho a la salud exige la disponibilidad inmediata de tratamientos médicos prescritos, incluso cuando no estén incluidos en el PBS, siendo relevante para sostener la obligación de la EPS de entregar tofacitinib ante riesgo de agravamiento clínico si no se suministra de forma oportuna. Finalmente, la Sentencia T-061 de 2014 refuerza que la negativa prolongada a suministrar un medicamento esencial sanciona la vulneración del derecho a la salud y puede justificar la tutela, especialmente cuando la demora causa un daño irreversible al paciente, como ocurre con la demora en la entrega de tofacitinib tras la negación del 2 de septiembre y la falta de respuesta al derecho de petición del 8 de septiembre.</w:t>
+        <w:t>Tengo derecho a la protección de mi salud, vida digna y seguridad social según los artículos 11, 48, 49 y 86 de la Constitución Política de Colombia. El Decreto 2591 de 1991 establece que la acción de tutela procede cuando se vulneran derechos fundamentales y no existe otro medio idóneo para su protección. La Ley 1751 de 2015 (Ley Estatutaria de Salud) garantiza el acceso oportuno a los servicios de salud necesarios. La Sentencia T-549 de 2023 establece que la EPS no puede negar un medicamento excluido del PBS alegando imposibilidad de financiación mediante MIPRES, ya que ello vulnera el derecho a la salud. La Sentencia T-124 de 2019 señala que los usuarios tienen derecho al tratamiento completo para su recuperación, procediendo la tutela cuando se niega un medicamento no incluido en el plan de beneficios. La Sentencia T-319 de 2025 reconoce protección especial a personas en condiciones de vulnerabilidad por edad y enfermedad, aplicable a mi caso como paciente de 54 años con artritis reumatoide que requiere tratamiento integral. La Sentencia T-728 de 2005 analiza la negativa de medicamento excluido del POS para artritis reumatoide severa, considerando la vulnerabilidad del paciente, lo que es directamente aplicable a la negativa de tofacitinib por parte de la EPS Salud Andina.</w:t>
       </w:r>
     </w:p>
     <w:p>
@@ -329,7 +329,7 @@
         <w:rPr>
           <w:b w:val="0"/>
         </w:rPr>
-        <w:t>1. Que se ordene a la EPS Salud Andina autorizar, garantizar y hacer efectiva la entrega inmediata del medicamento tofacitinib, formulado por mi reumatóloga el 3 de agosto de 2026, para el tratamiento de mi artritis reumatoide.</w:t>
+        <w:t>1. Que se ordene a la EPS Salud Andina autorizar, garantizar y suministrar de manera inmediata el medicamento tofacitinib formulado por mi médico tratante para el tratamiento de mi artritis reumatoide.</w:t>
       </w:r>
     </w:p>
     <w:p>
@@ -341,7 +341,7 @@
         <w:rPr>
           <w:b w:val="0"/>
         </w:rPr>
-        <w:t>2. Que se le ordene a la EPS Salud Andina proporcionar el medicamento tofacitinib de manera continua y conforme al esquema terapéutico indicado por el médico tratante, sin interrupciones ni nuevas negaciones injustificadas.</w:t>
+        <w:t>2. Que se le ordene a la EPS Salud Andina proporcionar el tratamiento integral y continuo necesario para mi condición, incluyendo el medicamento tofacitinib, dentro de un término máximo de 48 horas contadas desde la notificación de esta tutela.</w:t>
       </w:r>
     </w:p>
     <w:p>
@@ -353,19 +353,7 @@
         <w:rPr>
           <w:b w:val="0"/>
         </w:rPr>
-        <w:t>3. Que, en caso de que la EPS alegue falta de cobertura en el PBS, se le ordene gestionar el medicamento mediante los mecanismos de excepción y ampliación del PBS previstos en la ley, garantizando mi acceso al tratamiento esencial.</w:t>
-      </w:r>
-    </w:p>
-    <w:p>
-      <w:pPr>
-        <w:ind w:left="340" w:hanging="340"/>
-        <w:jc w:val="both"/>
-      </w:pPr>
-      <w:r>
-        <w:rPr>
-          <w:b w:val="0"/>
-        </w:rPr>
-        <w:t>4. Que se le imponga a la EPS Salud Andina una multa diaria por cada día de retraso en el cumplimiento de esta orden, conforme a lo dispuesto en el Decreto 2591 de 1991 y la jurisprudencia constitucional aplicable.</w:t>
+        <w:t>3. Que se le imponga a la EPS Salud Andina una multa diaria por cada día de retraso en el cumplimiento de la orden judicial, conforme a lo dispuesto en el Decreto 2591 de 1991.</w:t>
       </w:r>
     </w:p>
     <w:p>
@@ -389,7 +377,7 @@
         <w:rPr>
           <w:b w:val="0"/>
         </w:rPr>
-        <w:t>1. Copia de la fórmula médica del medicamento tofacitinib, fechada el 3 de agosto de 2026.</w:t>
+        <w:t>1. Copia de la carta de negación del medicamento tofacitinib fechada el 2 de septiembre de 2026.</w:t>
       </w:r>
     </w:p>
     <w:p>
@@ -401,7 +389,7 @@
         <w:rPr>
           <w:b w:val="0"/>
         </w:rPr>
-        <w:t>2. Copia de la carta de negación del medicamento tofacitinib recibida el 2 de septiembre de 2026.</w:t>
+        <w:t>2. Copia del radicado del derecho de petición presentado el 8 de septiembre de 2026.</w:t>
       </w:r>
     </w:p>
     <w:p>
@@ -413,19 +401,7 @@
         <w:rPr>
           <w:b w:val="0"/>
         </w:rPr>
-        <w:t>3. Copia del radicado del derecho de petición presentado ante la EPS Salud Andina el 8 de septiembre de 2026.</w:t>
-      </w:r>
-    </w:p>
-    <w:p>
-      <w:pPr>
-        <w:ind w:left="340" w:hanging="340"/>
-        <w:jc w:val="both"/>
-      </w:pPr>
-      <w:r>
-        <w:rPr>
-          <w:b w:val="0"/>
-        </w:rPr>
-        <w:t>4. Copias relevantes de mi historia clínica que evidencian el diagnóstico de artritis reumatoide y la necesidad del tratamiento con tofacitinib.</w:t>
+        <w:t>3. Copia de mi historia clínica relevante que respalda el diagnóstico de artritis reumatoide y la necesidad del medicamento tofacitinib.</w:t>
       </w:r>
     </w:p>
     <w:p>
@@ -448,7 +424,7 @@
         <w:rPr>
           <w:b w:val="0"/>
         </w:rPr>
-        <w:t>Juro solemnemente que no he presentado previamente otra acción de tutela por los mismos hechos y por la vulneración de los mismos derechos fundamentales aquí expuestos.</w:t>
+        <w:t>Juro solemnemente que no he presentado otra acción de tutela por los mismos hechos y con el mismo objeto que la presente acción.</w:t>
       </w:r>
     </w:p>
     <w:p>

</xml_diff>